<commit_message>
Map DOCX header placeholders from course title and schedule metadata.
Co-authored-by: Cursor <cursoragent@cursor.com>
</commit_message>
<xml_diff>
--- a/apps/api/assets/session-plan-template.docx
+++ b/apps/api/assets/session-plan-template.docx
@@ -350,7 +350,15 @@
                 <w:sz w:val="20"/>
                 <w:szCs w:val="20"/>
               </w:rPr>
-              <w:t>JSON, MongoDB create database, collections and insert record.</w:t>
+              <w:t xml:space="preserve">JSON, MongoDB create database, collections and insert </w:t>
+            </w:r>
+            <w:r>
+              <w:rPr>
+                <w:rFonts w:ascii="Arial" w:hAnsi="Arial" w:cs="Arial"/>
+                <w:sz w:val="20"/>
+                <w:szCs w:val="20"/>
+              </w:rPr>
+              <w:t>record.</w:t>
             </w:r>
           </w:p>
         </w:tc>
@@ -366,14 +374,6 @@
                 <w:szCs w:val="20"/>
               </w:rPr>
             </w:pPr>
-            <w:r>
-              <w:rPr>
-                <w:rFonts w:ascii="Arial" w:hAnsi="Arial" w:cs="Arial"/>
-                <w:sz w:val="20"/>
-                <w:szCs w:val="20"/>
-              </w:rPr>
-              <w:t/>
-            </w:r>
           </w:p>
         </w:tc>
         <w:tc>
@@ -432,14 +432,6 @@
                 <w:szCs w:val="20"/>
               </w:rPr>
             </w:pPr>
-            <w:r>
-              <w:rPr>
-                <w:rFonts w:ascii="Arial" w:hAnsi="Arial" w:cs="Arial"/>
-                <w:sz w:val="20"/>
-                <w:szCs w:val="20"/>
-              </w:rPr>
-              <w:t/>
-            </w:r>
           </w:p>
         </w:tc>
         <w:tc>
@@ -476,14 +468,6 @@
                 <w:szCs w:val="20"/>
               </w:rPr>
             </w:pPr>
-            <w:r>
-              <w:rPr>
-                <w:rFonts w:ascii="Arial" w:hAnsi="Arial" w:cs="Arial"/>
-                <w:sz w:val="20"/>
-                <w:szCs w:val="20"/>
-              </w:rPr>
-              <w:t/>
-            </w:r>
           </w:p>
         </w:tc>
       </w:tr>
@@ -567,14 +551,6 @@
                 <w:szCs w:val="20"/>
               </w:rPr>
             </w:pPr>
-            <w:r>
-              <w:rPr>
-                <w:rFonts w:ascii="Arial" w:hAnsi="Arial" w:cs="Arial"/>
-                <w:sz w:val="20"/>
-                <w:szCs w:val="20"/>
-              </w:rPr>
-              <w:t/>
-            </w:r>
           </w:p>
         </w:tc>
         <w:tc>
@@ -633,14 +609,6 @@
                 <w:szCs w:val="20"/>
               </w:rPr>
             </w:pPr>
-            <w:r>
-              <w:rPr>
-                <w:rFonts w:ascii="Arial" w:hAnsi="Arial" w:cs="Arial"/>
-                <w:sz w:val="20"/>
-                <w:szCs w:val="20"/>
-              </w:rPr>
-              <w:t/>
-            </w:r>
           </w:p>
         </w:tc>
         <w:tc>
@@ -677,14 +645,6 @@
                 <w:szCs w:val="20"/>
               </w:rPr>
             </w:pPr>
-            <w:r>
-              <w:rPr>
-                <w:rFonts w:ascii="Arial" w:hAnsi="Arial" w:cs="Arial"/>
-                <w:sz w:val="20"/>
-                <w:szCs w:val="20"/>
-              </w:rPr>
-              <w:t/>
-            </w:r>
           </w:p>
         </w:tc>
       </w:tr>
@@ -768,14 +728,6 @@
                 <w:szCs w:val="20"/>
               </w:rPr>
             </w:pPr>
-            <w:r>
-              <w:rPr>
-                <w:rFonts w:ascii="Arial" w:hAnsi="Arial" w:cs="Arial"/>
-                <w:sz w:val="20"/>
-                <w:szCs w:val="20"/>
-              </w:rPr>
-              <w:t/>
-            </w:r>
           </w:p>
         </w:tc>
         <w:tc>
@@ -878,14 +830,6 @@
                 <w:szCs w:val="20"/>
               </w:rPr>
             </w:pPr>
-            <w:r>
-              <w:rPr>
-                <w:rFonts w:ascii="Arial" w:hAnsi="Arial" w:cs="Arial"/>
-                <w:sz w:val="20"/>
-                <w:szCs w:val="20"/>
-              </w:rPr>
-              <w:t/>
-            </w:r>
           </w:p>
         </w:tc>
       </w:tr>
@@ -965,7 +909,7 @@
       <w:rPr>
         <w:b/>
       </w:rPr>
-      <w:t>Nehal Patel</w:t>
+      <w:t>{user-name}</w:t>
     </w:r>
     <w:r>
       <w:rPr>
@@ -989,7 +933,13 @@
       <w:rPr>
         <w:b/>
       </w:rPr>
-      <w:t>Date of Submission:  15/07/2026</w:t>
+      <w:t xml:space="preserve">Date of Submission:  </w:t>
+    </w:r>
+    <w:r>
+      <w:rPr>
+        <w:b/>
+      </w:rPr>
+      <w:t>{today}</w:t>
     </w:r>
     <w:r>
       <w:rPr>
@@ -1197,7 +1147,7 @@
               <w:sz w:val="36"/>
               <w:szCs w:val="28"/>
             </w:rPr>
-            <w:t xml:space="preserve">: 2026-27 </w:t>
+            <w:t xml:space="preserve">: {academic-year} </w:t>
           </w:r>
         </w:p>
         <w:p>
@@ -1217,7 +1167,34 @@
               <w:sz w:val="20"/>
               <w:szCs w:val="28"/>
             </w:rPr>
-            <w:t>For the Period &lt;01-Jul-2026&gt; To &lt;15-Jul-2026&gt;</w:t>
+            <w:t xml:space="preserve">For the Period </w:t>
+          </w:r>
+          <w:r>
+            <w:rPr>
+              <w:rFonts w:ascii="Arial" w:hAnsi="Arial" w:cs="Arial"/>
+              <w:b/>
+              <w:sz w:val="20"/>
+              <w:szCs w:val="28"/>
+            </w:rPr>
+            <w:t>{from-date}</w:t>
+          </w:r>
+          <w:r>
+            <w:rPr>
+              <w:rFonts w:ascii="Arial" w:hAnsi="Arial" w:cs="Arial"/>
+              <w:b/>
+              <w:sz w:val="20"/>
+              <w:szCs w:val="28"/>
+            </w:rPr>
+            <w:t xml:space="preserve"> To </w:t>
+          </w:r>
+          <w:r>
+            <w:rPr>
+              <w:rFonts w:ascii="Arial" w:hAnsi="Arial" w:cs="Arial"/>
+              <w:b/>
+              <w:sz w:val="20"/>
+              <w:szCs w:val="28"/>
+            </w:rPr>
+            <w:t>{to-date}</w:t>
           </w:r>
         </w:p>
         <w:p>
@@ -1277,7 +1254,7 @@
         <w:sz w:val="28"/>
         <w:szCs w:val="28"/>
       </w:rPr>
-      <w:t>TYBCA-G</w:t>
+      <w:t>{class-name}</w:t>
     </w:r>
     <w:r>
       <w:rPr>
@@ -1286,7 +1263,7 @@
         <w:sz w:val="28"/>
         <w:szCs w:val="28"/>
       </w:rPr>
-      <w:tab/>
+      <w:t>-</w:t>
     </w:r>
     <w:r>
       <w:rPr>
@@ -1295,7 +1272,7 @@
         <w:sz w:val="28"/>
         <w:szCs w:val="28"/>
       </w:rPr>
-      <w:tab/>
+      <w:t>{division}</w:t>
     </w:r>
     <w:r>
       <w:rPr>
@@ -1304,7 +1281,7 @@
         <w:sz w:val="28"/>
         <w:szCs w:val="28"/>
       </w:rPr>
-      <w:t>Subject:</w:t>
+      <w:tab/>
     </w:r>
     <w:r>
       <w:rPr>
@@ -1313,7 +1290,34 @@
         <w:sz w:val="28"/>
         <w:szCs w:val="28"/>
       </w:rPr>
-      <w:t xml:space="preserve"> Advance Web Designing</w:t>
+      <w:tab/>
+    </w:r>
+    <w:r>
+      <w:rPr>
+        <w:rFonts w:ascii="Arial" w:hAnsi="Arial" w:cs="Arial"/>
+        <w:b/>
+        <w:sz w:val="28"/>
+        <w:szCs w:val="28"/>
+      </w:rPr>
+      <w:t>Subject:</w:t>
+    </w:r>
+    <w:r>
+      <w:rPr>
+        <w:rFonts w:ascii="Arial" w:hAnsi="Arial" w:cs="Arial"/>
+        <w:b/>
+        <w:sz w:val="28"/>
+        <w:szCs w:val="28"/>
+      </w:rPr>
+      <w:t xml:space="preserve"> </w:t>
+    </w:r>
+    <w:r>
+      <w:rPr>
+        <w:rFonts w:ascii="Arial" w:hAnsi="Arial" w:cs="Arial"/>
+        <w:b/>
+        <w:sz w:val="28"/>
+        <w:szCs w:val="28"/>
+      </w:rPr>
+      <w:t>{subject-name}</w:t>
     </w:r>
     <w:r>
       <w:rPr>

</xml_diff>